<commit_message>
Rename paper to official submission format and update cover letter
</commit_message>
<xml_diff>
--- a/01_Paper/07_05_Cover_Letter_JFM.docx
+++ b/01_Paper/07_05_Cover_Letter_JFM.docx
@@ -15,13 +15,7 @@
           <w:i/>
           <w:iCs/>
         </w:rPr>
-        <w:t>[Your City, State]</w:t>
-      </w:r>
-      <w:r>
-        <w:rPr>
-          <w:rFonts w:ascii="Times New Roman" w:hAnsi="Times New Roman" w:cs="Times New Roman"/>
-        </w:rPr>
-        <w:t xml:space="preserve"> </w:t>
+        <w:t>Fort Worth</w:t>
       </w:r>
       <w:r>
         <w:rPr>
@@ -29,7 +23,37 @@
           <w:i/>
           <w:iCs/>
         </w:rPr>
-        <w:t>[Today's Date]</w:t>
+        <w:t xml:space="preserve">, </w:t>
+      </w:r>
+      <w:r>
+        <w:rPr>
+          <w:rFonts w:ascii="Times New Roman" w:hAnsi="Times New Roman" w:cs="Times New Roman"/>
+          <w:i/>
+          <w:iCs/>
+        </w:rPr>
+        <w:t>T</w:t>
+      </w:r>
+      <w:r>
+        <w:rPr>
+          <w:rFonts w:ascii="Times New Roman" w:hAnsi="Times New Roman" w:cs="Times New Roman"/>
+          <w:i/>
+          <w:iCs/>
+        </w:rPr>
+        <w:t>x,</w:t>
+      </w:r>
+      <w:r>
+        <w:rPr>
+          <w:rFonts w:ascii="Times New Roman" w:hAnsi="Times New Roman" w:cs="Times New Roman"/>
+        </w:rPr>
+        <w:t xml:space="preserve"> </w:t>
+      </w:r>
+      <w:r>
+        <w:rPr>
+          <w:rFonts w:ascii="Times New Roman" w:hAnsi="Times New Roman" w:cs="Times New Roman"/>
+          <w:i/>
+          <w:iCs/>
+        </w:rPr>
+        <w:t>05/07/2026</w:t>
       </w:r>
     </w:p>
     <w:p>
@@ -343,7 +367,19 @@
         <w:rPr>
           <w:rFonts w:ascii="Times New Roman" w:hAnsi="Times New Roman" w:cs="Times New Roman"/>
         </w:rPr>
-        <w:t xml:space="preserve"> Approximately 9,500 words (excluding references, tables, and figures)</w:t>
+        <w:t xml:space="preserve"> Approximately </w:t>
+      </w:r>
+      <w:r>
+        <w:rPr>
+          <w:rFonts w:ascii="Times New Roman" w:hAnsi="Times New Roman" w:cs="Times New Roman"/>
+        </w:rPr>
+        <w:t>8600</w:t>
+      </w:r>
+      <w:r>
+        <w:rPr>
+          <w:rFonts w:ascii="Times New Roman" w:hAnsi="Times New Roman" w:cs="Times New Roman"/>
+        </w:rPr>
+        <w:t xml:space="preserve"> words (excluding references, tables, and figures)</w:t>
       </w:r>
     </w:p>
     <w:p>
@@ -571,7 +607,7 @@
     </w:p>
     <w:p>
       <w:pPr>
-        <w:spacing w:line="240" w:lineRule="auto"/>
+        <w:spacing w:line="276" w:lineRule="auto"/>
         <w:rPr>
           <w:rFonts w:ascii="Times New Roman" w:hAnsi="Times New Roman" w:cs="Times New Roman"/>
         </w:rPr>
@@ -588,7 +624,7 @@
         <w:rPr>
           <w:rFonts w:ascii="Times New Roman" w:hAnsi="Times New Roman" w:cs="Times New Roman"/>
         </w:rPr>
-        <w:t xml:space="preserve"> MS Engineering Management University of North Texas, Denton, TX Email: [your email address] LinkedIn: [your LinkedIn] GitHub: </w:t>
+        <w:t xml:space="preserve"> MS Engineering Management University of North Texas, Denton, TX Email: </w:t>
       </w:r>
       <w:hyperlink r:id="rId5" w:history="1">
         <w:r>
@@ -596,7 +632,60 @@
             <w:rStyle w:val="Hyperlink"/>
             <w:rFonts w:ascii="Times New Roman" w:hAnsi="Times New Roman" w:cs="Times New Roman"/>
           </w:rPr>
-          <w:t>https://github.com/bvskrishna3137</w:t>
+          <w:t>bvskrishna3137@gmail.com</w:t>
+        </w:r>
+      </w:hyperlink>
+      <w:r>
+        <w:rPr>
+          <w:rFonts w:ascii="Times New Roman" w:hAnsi="Times New Roman" w:cs="Times New Roman"/>
+        </w:rPr>
+        <w:t xml:space="preserve"> </w:t>
+      </w:r>
+    </w:p>
+    <w:p>
+      <w:pPr>
+        <w:spacing w:line="276" w:lineRule="auto"/>
+        <w:rPr>
+          <w:rFonts w:ascii="Times New Roman" w:hAnsi="Times New Roman" w:cs="Times New Roman"/>
+        </w:rPr>
+      </w:pPr>
+      <w:r>
+        <w:rPr>
+          <w:rFonts w:ascii="Times New Roman" w:hAnsi="Times New Roman" w:cs="Times New Roman"/>
+        </w:rPr>
+        <w:t xml:space="preserve">LinkedIn: </w:t>
+      </w:r>
+      <w:hyperlink r:id="rId6" w:history="1">
+        <w:r>
+          <w:rPr>
+            <w:rStyle w:val="Hyperlink"/>
+            <w:rFonts w:ascii="Times New Roman" w:hAnsi="Times New Roman" w:cs="Times New Roman"/>
+            <w:b/>
+            <w:bCs/>
+          </w:rPr>
+          <w:t>www.linkedin.com/in/saikrishna30</w:t>
+        </w:r>
+      </w:hyperlink>
+    </w:p>
+    <w:p>
+      <w:pPr>
+        <w:spacing w:line="276" w:lineRule="auto"/>
+        <w:rPr>
+          <w:rFonts w:ascii="Times New Roman" w:hAnsi="Times New Roman" w:cs="Times New Roman"/>
+        </w:rPr>
+      </w:pPr>
+      <w:r>
+        <w:rPr>
+          <w:rFonts w:ascii="Times New Roman" w:hAnsi="Times New Roman" w:cs="Times New Roman"/>
+        </w:rPr>
+        <w:t xml:space="preserve">GitHub: </w:t>
+      </w:r>
+      <w:hyperlink r:id="rId7" w:history="1">
+        <w:r>
+          <w:rPr>
+            <w:rStyle w:val="Hyperlink"/>
+          </w:rPr>
+          <w:t>https://github.com/bvskrishna3137/ERP-FacilityManagement-Research</w:t>
         </w:r>
       </w:hyperlink>
     </w:p>
@@ -1494,6 +1583,7 @@
   <w:style w:type="character" w:default="1" w:styleId="DefaultParagraphFont">
     <w:name w:val="Default Paragraph Font"/>
     <w:uiPriority w:val="1"/>
+    <w:semiHidden/>
     <w:unhideWhenUsed/>
   </w:style>
   <w:style w:type="table" w:default="1" w:styleId="TableNormal">

</xml_diff>